<commit_message>
Bring the marketing docs up to the fourth review's changes
Guide (HTML and the rebuilt Word file):
- Each mission ends in a conversation, with another way to do it; twenty-six
  mission steps, not twenty-two, everywhere they're counted
- Year 7-9: a nearer future, Next Chapter as next year at school, and more
  concrete story tasks, citing a new reference 25 (Habermas & Bluck, 2000);
  the Oyserman reference now covers the Year 7-9 Next Chapter
- "Track your students' progress" now says what exists: completion totals
  across everyone, under-five counts hidden, no per-class or per-student view
- Evidence answer mentions the completion counts from 20 October, as
  feasibility data and never evidence it works
- Safeguarding answer: the checks include some online slang and will miss a
  lot, and every other language, until co-designed with young people

Parent handout: the missions end in a chat with someone, not an optional one.

Co-Authored-By: Claude Opus 5.5 <noreply@anthropic.com>
</commit_message>
<xml_diff>
--- a/docs/marketing/Groundwork-Marketing-Guide.docx
+++ b/docs/marketing/Groundwork-Marketing-Guide.docx
@@ -161,7 +161,7 @@
           <w:sz w:val="20"/>
           <w:szCs w:val="20"/>
         </w:rPr>
-        <w:t xml:space="preserve">One big question each: four or five reflective steps of 2–15 minutes, then a challenge carried through a week. Twenty-two steps in all, starting with a two-minute look at the story so far. Each mission also has an optional conversation with someone in the student's life, which Home suggests for a month after the mission is finished.</w:t>
+        <w:t xml:space="preserve">One big question each: four or five reflective steps of 2–15 minutes, a challenge carried through a week, then a conversation with someone in the student's life, with another way to do it for anyone who has nobody to ask. Twenty-six steps in all, starting with a two-minute look at the story so far.</w:t>
       </w:r>
     </w:p>
     <w:p>
@@ -1832,7 +1832,7 @@
                 <w:sz w:val="19"/>
                 <w:szCs w:val="19"/>
               </w:rPr>
-              <w:t xml:space="preserve">Social identity theory on group membership as a pillar of self (ref 11). Putnam's bridging-versus-bonding distinction underwrites the cross-difference activity (ref 12). McAdams: people who can say who shaped them hold a more coherent identity (ref 13). A brief belonging intervention halved a three-year GPA gap and improved self-reported health (ref 14). Its optional conversation asks an older relative where the family comes from: young people who know more of their family's stories report higher self-esteem and a stronger sense of control over their lives (ref 24).</w:t>
+              <w:t xml:space="preserve">Social identity theory on group membership as a pillar of self (ref 11). Putnam's bridging-versus-bonding distinction underwrites the cross-difference activity (ref 12). McAdams: people who can say who shaped them hold a more coherent identity (ref 13). A brief belonging intervention halved a three-year GPA gap and improved self-reported health (ref 14). Its conversation asks an older relative where the family comes from: young people who know more of their family's stories report higher self-esteem and a stronger sense of control over their lives (ref 24).</w:t>
             </w:r>
           </w:p>
         </w:tc>
@@ -2044,7 +2044,7 @@
                 <w:sz w:val="19"/>
                 <w:szCs w:val="19"/>
               </w:rPr>
-              <w:t xml:space="preserve">Turns “what do you want to do after school?” from a question that produces panic into one that produces a sentence. Especially load-bearing for Year 12, who also get Your Next Chapter: the version of next year they're hoping for, the one they'd rather avoid, a step for each, and a conversation with someone already doing it.</w:t>
+              <w:t xml:space="preserve">Turns “what do you want to do after school?” from a question that produces panic into one that produces a sentence. Especially load-bearing for Year 12, who also get Your Next Chapter: the version of next year they're hoping for, the one they'd rather avoid, a step for each, and a conversation with someone already doing it. Year 7–9 get the same shape at a nearer distance: an ordinary Tuesday at 16, and next year at school.</w:t>
             </w:r>
           </w:p>
         </w:tc>
@@ -5009,7 +5009,7 @@
                 <w:sz w:val="18"/>
                 <w:szCs w:val="18"/>
               </w:rPr>
-              <w:t xml:space="preserve">It adapts on one real axis: life stage, chosen at onboarding (Year 7–9, 10–11 or 12, just left school, or a few years out). That changes the examples, and for Year 12 and school leavers it puts next-year planning first. For anyone who has left school, the questions set at school are reworded for work and study, and the future steps picture an age a few years ahead of theirs rather than a fixed 21. Everyone starts with Mission 1. Describe that specifically. “Personalised” unqualified implies an adaptive engine that isn't there.</w:t>
+              <w:t xml:space="preserve">It adapts on one real axis: life stage, chosen at onboarding (Year 7–9, 10–11 or 12, just left school, or a few years out). That changes the examples, and for Year 12 and school leavers it puts next-year planning first. For anyone who has left school, the questions set at school are reworded for work and study, and the future steps picture an age a few years ahead of theirs rather than a fixed 21. Year 7–9 picture a nearer future and get more concrete versions of the story tasks, because finding one theme across your life mostly arrives later in adolescence (ref 25). Everyone starts with Mission 1. Describe that specifically. “Personalised” unqualified implies an adaptive engine that isn't there.</w:t>
             </w:r>
           </w:p>
         </w:tc>
@@ -5579,7 +5579,7 @@
                 <w:sz w:val="18"/>
                 <w:szCs w:val="18"/>
               </w:rPr>
-              <w:t xml:space="preserve">There is no teacher dashboard and journals are private by design. Promising visibility that doesn't exist — and shouldn't — sets up a failed implementation. If a school needs oversight, sell completion counts, never content.</w:t>
+              <w:t xml:space="preserve">There is no teacher dashboard and journals are private by design. Promising visibility that doesn't exist — and shouldn't — sets up a failed implementation. The most Groundwork can offer is completion totals: how many students finish each step, across everyone, with counts under five hidden. There's no per-class or per-student view, so don't promise one, and never anything a student wrote.</w:t>
             </w:r>
           </w:p>
         </w:tc>
@@ -5742,7 +5742,7 @@
           <w:sz w:val="20"/>
           <w:szCs w:val="20"/>
         </w:rPr>
-        <w:t xml:space="preserve"> Self-guided, twenty-two mission steps plus a weekly cadence, at the student's pace.</w:t>
+        <w:t xml:space="preserve"> Self-guided, twenty-six mission steps plus a weekly cadence, at the student's pace.</w:t>
       </w:r>
     </w:p>
     <w:p>
@@ -5772,7 +5772,7 @@
           <w:sz w:val="20"/>
           <w:szCs w:val="20"/>
         </w:rPr>
-        <w:t xml:space="preserve"> Everyone starts with Mission 1, then the weeks run one at a time. Examples change with life stage. Year 10–11s are offered Your Next Chapter around subject choice, and Year 12s and school leavers get next-year planning — Your Next Chapter, pathways and goals — first. Students who have left school get questions about work and study, not the classroom.</w:t>
+        <w:t xml:space="preserve"> Everyone starts with Mission 1, then the weeks run one at a time. Examples change with life stage. Year 10–11s are offered Your Next Chapter around subject choice, and Year 12s and school leavers get next-year planning — Your Next Chapter, pathways and goals — first. Students who have left school get questions about work and study, not the classroom. Year 7–9 get a nearer future, more concrete tasks, and less to read before each question.</w:t>
       </w:r>
     </w:p>
     <w:p>
@@ -5969,7 +5969,7 @@
           <w:sz w:val="20"/>
           <w:szCs w:val="20"/>
         </w:rPr>
-        <w:t xml:space="preserve"> Each mission has an optional conversation — what they were like as a kid, where the family comes from, how you chose your path — and week 8 asks them to name two adults worth learning from and go and spend time with them.</w:t>
+        <w:t xml:space="preserve"> Each mission ends in a conversation — what they were like as a kid, where the family comes from, how you chose your path — and week 8 asks them to name two adults worth learning from and go and spend time with them.</w:t>
       </w:r>
     </w:p>
     <w:p>
@@ -6386,7 +6386,7 @@
           <w:sz w:val="20"/>
           <w:szCs w:val="20"/>
         </w:rPr>
-        <w:t xml:space="preserve">Agreed, and Groundwork is built to be a low-frequency one. There are no notifications, no streaks, and no daily engagement target — the app has nothing to gain from a student being on it. The weekly cadence is one question and one action; the mission steps run 2–15 minutes each, twenty-two of them across the whole programme.</w:t>
+        <w:t xml:space="preserve">Agreed, and Groundwork is built to be a low-frequency one. There are no notifications, no streaks, and no daily engagement target — the app has nothing to gain from a student being on it. The weekly cadence is one question and one action; the mission steps run 2–15 minutes each, twenty-six of them across the whole programme.</w:t>
       </w:r>
     </w:p>
     <w:p>
@@ -6431,7 +6431,7 @@
           <w:sz w:val="20"/>
           <w:szCs w:val="20"/>
         </w:rPr>
-        <w:t xml:space="preserve">Answer this one precisely and without spin, because getting it wrong is a safeguarding problem. Journals are private — no teacher or parent view exists. The app therefore does not and cannot function as a disclosure channel, and it says so: it states plainly that it isn't a therapy app; a “Need to talk?” button on every screen lists free services, including Kids Helpline (1800 55 1800 in Australia); and if something a student writes sounds like they may be at risk, the app shows those services in place of its usual follow-up questions. That check is not saved, flagged or seen by anyone, so it is not a referral: it puts help in front of the student, not in front of an adult. In the same way, if several of a student's recent entries are very hard on themselves, the app suggests a different move — talking to someone, or ten minutes doing something else — again without saving or flagging anything. The risk check runs on every reflection a student saves; the hard-on-yourself check runs on mission steps, weekly reflections, Your Next Chapter and the paragraph in My story. Both match English phrases only, so they miss slang and other languages. Never describe them as monitoring.</w:t>
+        <w:t xml:space="preserve">Answer this one precisely and without spin, because getting it wrong is a safeguarding problem. Journals are private — no teacher or parent view exists. The app therefore does not and cannot function as a disclosure channel, and it says so: it states plainly that it isn't a therapy app; a “Need to talk?” button on every screen lists free services, including Kids Helpline (1800 55 1800 in Australia); and if something a student writes sounds like they may be at risk, the app shows those services in place of its usual follow-up questions. That check is not saved, flagged or seen by anyone, so it is not a referral: it puts help in front of the student, not in front of an adult. In the same way, if several of a student's recent entries are very hard on themselves, the app suggests a different move — talking to someone, or ten minutes doing something else — again without saving or flagging anything. The risk check runs on every reflection a student saves; the hard-on-yourself check runs on mission steps, weekly reflections, Your Next Chapter and the paragraph in My story. Both match a list of English phrases, including some common online slang. Until they're co-designed with young people they'll still miss a lot, and every other language. Never describe them as monitoring.</w:t>
       </w:r>
     </w:p>
     <w:p>
@@ -6549,7 +6549,7 @@
           <w:sz w:val="20"/>
           <w:szCs w:val="20"/>
         </w:rPr>
-        <w:t xml:space="preserve">There is a written plan for that pilot: validated scales for each thing the check-in measures, run by a university research partner rather than inside the app, a comparison group that starts a term later, and the ethics and education-department approvals it needs. Say a pilot is planned, not that one is running, until a partner and approval are in place.</w:t>
+        <w:t xml:space="preserve">There is a written plan for that pilot: validated scales for each thing the check-in measures, run by a university research partner rather than inside the app, a comparison group that starts a term later, and the ethics and education-department approvals it needs. Say a pilot is planned, not that one is running, until a partner and approval are in place. From 20 October the app can also report how many students finish each step, as totals with small numbers hidden. That's useful for a pilot's feasibility measures, but it's never evidence that Groundwork works.</w:t>
       </w:r>
     </w:p>
     <w:p>
@@ -7072,7 +7072,7 @@
           <w:sz w:val="20"/>
           <w:szCs w:val="20"/>
         </w:rPr>
-        <w:t xml:space="preserve">Items 1, 2, 5–8, 11–13 and 15 are the frameworks Groundwork's activities are built on. Items 3, 4, 9, 10, 14 and 16–24 are the empirical results quoted in this guide. Verified September 2026; item 24 added October 2026.</w:t>
+        <w:t xml:space="preserve">Items 1, 2, 5–8, 11–13 and 15 are the frameworks Groundwork's activities are built on. Items 3, 4, 9, 10, 14 and 16–25 are the empirical results quoted in this guide. Verified September 2026; items 24 and 25 added October 2026.</w:t>
       </w:r>
     </w:p>
     <w:p>
@@ -8080,7 +8080,7 @@
           <w:sz w:val="17"/>
           <w:szCs w:val="17"/>
         </w:rPr>
-        <w:t xml:space="preserve">141 intervention / 123 control Year 8 students; grades, test scores and attendance up, misbehaviour and depression down, sustained at two years. Also the basis for Your Next Chapter.</w:t>
+        <w:t xml:space="preserve">141 intervention / 123 control Year 8 students; grades, test scores and attendance up, misbehaviour and depression down, sustained at two years. Also the basis for Your Next Chapter, including the Year 7–9 version about next year at school.</w:t>
       </w:r>
     </w:p>
     <w:p>
@@ -8584,7 +8584,70 @@
           <w:sz w:val="17"/>
           <w:szCs w:val="17"/>
         </w:rPr>
-        <w:t xml:space="preserve">Knowing more family stories goes with higher self-esteem and a stronger sense of control — Mission 3's optional conversation.</w:t>
+        <w:t xml:space="preserve">Knowing more family stories goes with higher self-esteem and a stronger sense of control — Mission 3's conversation.</w:t>
+      </w:r>
+    </w:p>
+    <w:p>
+      <w:pPr>
+        <w:spacing w:after="20" w:before="100" w:line="264"/>
+        <w:ind w:left="420" w:hanging="420"/>
+      </w:pPr>
+      <w:r>
+        <w:rPr>
+          <w:rFonts w:ascii="Calibri" w:cs="Calibri" w:eastAsia="Calibri" w:hAnsi="Calibri"/>
+          <w:b/>
+          <w:bCs/>
+          <w:color w:val="17222E"/>
+          <w:sz w:val="19"/>
+          <w:szCs w:val="19"/>
+        </w:rPr>
+        <w:t xml:space="preserve">25.  </w:t>
+      </w:r>
+      <w:r>
+        <w:rPr>
+          <w:rFonts w:ascii="Calibri" w:cs="Calibri" w:eastAsia="Calibri" w:hAnsi="Calibri"/>
+          <w:color w:val="4E5A66"/>
+          <w:sz w:val="19"/>
+          <w:szCs w:val="19"/>
+        </w:rPr>
+        <w:t xml:space="preserve">Habermas, T., &amp; Bluck, S. (2000). Getting a life: The emergence of the life story in adolescence. </w:t>
+      </w:r>
+      <w:r>
+        <w:rPr>
+          <w:rFonts w:ascii="Calibri" w:cs="Calibri" w:eastAsia="Calibri" w:hAnsi="Calibri"/>
+          <w:i/>
+          <w:iCs/>
+          <w:color w:val="4E5A66"/>
+          <w:sz w:val="19"/>
+          <w:szCs w:val="19"/>
+        </w:rPr>
+        <w:t xml:space="preserve">Psychological Bulletin, 126</w:t>
+      </w:r>
+      <w:r>
+        <w:rPr>
+          <w:rFonts w:ascii="Calibri" w:cs="Calibri" w:eastAsia="Calibri" w:hAnsi="Calibri"/>
+          <w:color w:val="4E5A66"/>
+          <w:sz w:val="19"/>
+          <w:szCs w:val="19"/>
+        </w:rPr>
+        <w:t xml:space="preserve">(5), 748–769.</w:t>
+      </w:r>
+    </w:p>
+    <w:p>
+      <w:pPr>
+        <w:spacing w:after="60" w:line="252"/>
+        <w:ind w:left="420"/>
+      </w:pPr>
+      <w:r>
+        <w:rPr>
+          <w:rFonts w:ascii="Calibri" w:cs="Calibri" w:eastAsia="Calibri" w:hAnsi="Calibri"/>
+          <w:i/>
+          <w:iCs/>
+          <w:color w:val="7E8892"/>
+          <w:sz w:val="17"/>
+          <w:szCs w:val="17"/>
+        </w:rPr>
+        <w:t xml:space="preserve">Finding one theme across your life mostly arrives in late adolescence — why Year 7–9 get more concrete versions of the Through-Line, the story sentence and the yearly paragraph.</w:t>
       </w:r>
     </w:p>
     <w:p>

</xml_diff>

<commit_message>
Add the curriculum line to the marketing guide
A "say it" claim for the HPE Identities and change content and the
Wellbeing Framework, with the wording to use and avoid; a "never say"
for implying coverage of consent, respectful relationships or protective
behaviours; the curriculum mapping in the school-leader bullet and the
cold email; references 26 and 27. HTML, build script and the rebuilt
.docx kept in step.

Co-Authored-By: Claude Opus 5.5 <noreply@anthropic.com>
</commit_message>
<xml_diff>
--- a/docs/marketing/Groundwork-Marketing-Guide.docx
+++ b/docs/marketing/Groundwork-Marketing-Guide.docx
@@ -4693,7 +4693,7 @@
                 <w:sz w:val="18"/>
                 <w:szCs w:val="18"/>
               </w:rPr>
-              <w:t xml:space="preserve">“No teacher or parent can read a student's journal. That's a design decision, not a settings default.”</w:t>
+              <w:t xml:space="preserve">“Groundwork gives students practice in the Identities and change content of the Australian Curriculum’s HPE learning area, and fits the Student voice and Support elements of the Australian Student Wellbeing Framework.”</w:t>
             </w:r>
           </w:p>
         </w:tc>
@@ -4724,7 +4724,7 @@
                 <w:sz w:val="18"/>
                 <w:szCs w:val="18"/>
               </w:rPr>
-              <w:t xml:space="preserve">True and enforced in the schema's row-level security. Lead with it in parent communications rather than burying it — it is the objection you would otherwise spend the meeting on.</w:t>
+              <w:t xml:space="preserve">Mapped code by code in the repository (docs/curriculum-alignment.md): AC9HP8P01–P02 for Years 7–8 and AC9HP10P01–P02 for Years 9–10, part of the Personal, social and community health strand, plus the Personal and Social and Ethical Understanding capabilities. Say “gives practice in” or “supports”, never “covers” or “delivers”: nothing in Groundwork is taught or assessed. Name the strand, because there’s nothing for Movement and physical activity. The mapping stops at Year 10, which is where the F–10 curriculum ends. (refs 26, 27)</w:t>
             </w:r>
           </w:p>
         </w:tc>
@@ -4757,7 +4757,7 @@
                 <w:sz w:val="18"/>
                 <w:szCs w:val="18"/>
               </w:rPr>
-              <w:t xml:space="preserve">CAREFULLY</w:t>
+              <w:t xml:space="preserve">SAY IT</w:t>
             </w:r>
           </w:p>
         </w:tc>
@@ -4788,7 +4788,7 @@
                 <w:sz w:val="18"/>
                 <w:szCs w:val="18"/>
               </w:rPr>
-              <w:t xml:space="preserve">“Writing about yourself has measurable benefits.”</w:t>
+              <w:t xml:space="preserve">“No teacher or parent can read a student's journal. That's a design decision, not a settings default.”</w:t>
             </w:r>
           </w:p>
         </w:tc>
@@ -4819,7 +4819,7 @@
                 <w:sz w:val="18"/>
                 <w:szCs w:val="18"/>
               </w:rPr>
-              <w:t xml:space="preserve">True but small. The best meta-analysis of experimental disclosure found an average effect of r = .075 across 146 randomised studies — real, cheap to deliver, and considerably smaller than earlier syntheses claimed. Say “a small, well-replicated benefit”. Never imply it is therapeutic. (ref 22)</w:t>
+              <w:t xml:space="preserve">True and enforced in the schema's row-level security. Lead with it in parent communications rather than burying it — it is the objection you would otherwise spend the meeting on.</w:t>
             </w:r>
           </w:p>
         </w:tc>
@@ -4883,7 +4883,7 @@
                 <w:sz w:val="18"/>
                 <w:szCs w:val="18"/>
               </w:rPr>
-              <w:t xml:space="preserve">“Character education works.”</w:t>
+              <w:t xml:space="preserve">“Writing about yourself has measurable benefits.”</w:t>
             </w:r>
           </w:p>
         </w:tc>
@@ -4914,7 +4914,7 @@
                 <w:sz w:val="18"/>
                 <w:szCs w:val="18"/>
               </w:rPr>
-              <w:t xml:space="preserve">The evidence base is real but uneven in quality, and effective programmes share features — multi-year, whole-school, adult modelling — that a self-guided app does not supply on its own. Position Groundwork as the student-facing spine of a character programme, not a replacement for one. (ref 23)</w:t>
+              <w:t xml:space="preserve">True but small. The best meta-analysis of experimental disclosure found an average effect of r = .075 across 146 randomised studies — real, cheap to deliver, and considerably smaller than earlier syntheses claimed. Say “a small, well-replicated benefit”. Never imply it is therapeutic. (ref 22)</w:t>
             </w:r>
           </w:p>
         </w:tc>
@@ -4978,7 +4978,7 @@
                 <w:sz w:val="18"/>
                 <w:szCs w:val="18"/>
               </w:rPr>
-              <w:t xml:space="preserve">“The programme is personalised to each student.”</w:t>
+              <w:t xml:space="preserve">“Character education works.”</w:t>
             </w:r>
           </w:p>
         </w:tc>
@@ -5009,7 +5009,7 @@
                 <w:sz w:val="18"/>
                 <w:szCs w:val="18"/>
               </w:rPr>
-              <w:t xml:space="preserve">It adapts on one real axis: life stage, chosen at onboarding (Year 7–9, 10–11 or 12, just left school, or a few years out). That changes the examples, and for Year 12 and school leavers it puts next-year planning first. For anyone who has left school, the questions set at school are reworded for work and study, and the future steps picture an age a few years ahead of theirs rather than a fixed 21. Year 7–9 picture a nearer future and get more concrete versions of the story tasks, because finding one theme across your life mostly arrives later in adolescence (ref 25). Everyone starts with Mission 1. Describe that specifically. “Personalised” unqualified implies an adaptive engine that isn't there.</w:t>
+              <w:t xml:space="preserve">The evidence base is real but uneven in quality, and effective programmes share features — multi-year, whole-school, adult modelling — that a self-guided app does not supply on its own. Position Groundwork as the student-facing spine of a character programme, not a replacement for one. (ref 23)</w:t>
             </w:r>
           </w:p>
         </w:tc>
@@ -5073,7 +5073,7 @@
                 <w:sz w:val="18"/>
                 <w:szCs w:val="18"/>
               </w:rPr>
-              <w:t xml:space="preserve">“Students get to see whether it's made a difference to them.”</w:t>
+              <w:t xml:space="preserve">“The programme is personalised to each student.”</w:t>
             </w:r>
           </w:p>
         </w:tc>
@@ -5104,7 +5104,7 @@
                 <w:sz w:val="18"/>
                 <w:szCs w:val="18"/>
               </w:rPr>
-              <w:t xml:space="preserve">A nine-question check-in during sign-up (straight after a one-minute story) and again ten weeks later shows each student their own change. The questions are Groundwork's own wording, not a validated scale, and answers are only shown back to the student — they are not counted in totals without ethics review and consent. Never quote check-in results as evidence that Groundwork works.</w:t>
+              <w:t xml:space="preserve">It adapts on one real axis: life stage, chosen at onboarding (Year 7–9, 10–11 or 12, just left school, or a few years out). That changes the examples, and for Year 12 and school leavers it puts next-year planning first. For anyone who has left school, the questions set at school are reworded for work and study, and the future steps picture an age a few years ahead of theirs rather than a fixed 21. Year 7–9 picture a nearer future and get more concrete versions of the story tasks, because finding one theme across your life mostly arrives later in adolescence (ref 25). Everyone starts with Mission 1. Describe that specifically. “Personalised” unqualified implies an adaptive engine that isn't there.</w:t>
             </w:r>
           </w:p>
         </w:tc>
@@ -5168,7 +5168,7 @@
                 <w:sz w:val="18"/>
                 <w:szCs w:val="18"/>
               </w:rPr>
-              <w:t xml:space="preserve">“It's locked, so nobody else can read it.”</w:t>
+              <w:t xml:space="preserve">“Students get to see whether it's made a difference to them.”</w:t>
             </w:r>
           </w:p>
         </w:tc>
@@ -5199,7 +5199,7 @@
                 <w:sz w:val="18"/>
                 <w:szCs w:val="18"/>
               </w:rPr>
-              <w:t xml:space="preserve">A student can set an optional four-digit code that locks the app on that device, and the most personal entries stay hidden in the Journal until tapped. Say exactly that. The app itself says the code stops a casual look, not someone determined: it lives on the device, and getting past it means signing out, which then needs the account password.</w:t>
+              <w:t xml:space="preserve">A nine-question check-in during sign-up (straight after a one-minute story) and again ten weeks later shows each student their own change. The questions are Groundwork's own wording, not a validated scale, and answers are only shown back to the student — they are not counted in totals without ethics review and consent. Never quote check-in results as evidence that Groundwork works.</w:t>
             </w:r>
           </w:p>
         </w:tc>
@@ -5263,7 +5263,7 @@
                 <w:sz w:val="18"/>
                 <w:szCs w:val="18"/>
               </w:rPr>
-              <w:t xml:space="preserve">“It supports students' cultural identity.”</w:t>
+              <w:t xml:space="preserve">“It's locked, so nobody else can read it.”</w:t>
             </w:r>
           </w:p>
         </w:tc>
@@ -5294,7 +5294,7 @@
                 <w:sz w:val="18"/>
                 <w:szCs w:val="18"/>
               </w:rPr>
-              <w:t xml:space="preserve">Mission 3 has an optional Culture and Heritage step: four questions, each one skippable, kept private and never sent to the AI. Its wording was drafted without community input and is waiting for review by people from the communities it speaks to. Describe it exactly if asked. Don't promote it, or call it culturally safe or co-designed, until that review has happened.</w:t>
+              <w:t xml:space="preserve">A student can set an optional four-digit code that locks the app on that device, and the most personal entries stay hidden in the Journal until tapped. Say exactly that. The app itself says the code stops a casual look, not someone determined: it lives on the device, and getting past it means signing out, which then needs the account password.</w:t>
             </w:r>
           </w:p>
         </w:tc>
@@ -5327,7 +5327,7 @@
                 <w:sz w:val="18"/>
                 <w:szCs w:val="18"/>
               </w:rPr>
-              <w:t xml:space="preserve">NEVER</w:t>
+              <w:t xml:space="preserve">CAREFULLY</w:t>
             </w:r>
           </w:p>
         </w:tc>
@@ -5358,7 +5358,7 @@
                 <w:sz w:val="18"/>
                 <w:szCs w:val="18"/>
               </w:rPr>
-              <w:t xml:space="preserve">Anything that positions Groundwork as therapy, treatment, or a mental-health intervention.</w:t>
+              <w:t xml:space="preserve">“It supports students' cultural identity.”</w:t>
             </w:r>
           </w:p>
         </w:tc>
@@ -5389,7 +5389,7 @@
                 <w:sz w:val="18"/>
                 <w:szCs w:val="18"/>
               </w:rPr>
-              <w:t xml:space="preserve">The app says “this isn't a therapy app” on its own landing page and in settings, and directs students to Kids Helpline. Marketing must not contradict the product. This also keeps Groundwork out of a regulatory category it is not built for.</w:t>
+              <w:t xml:space="preserve">Mission 3 has an optional Culture and Heritage step: four questions, each one skippable, kept private and never sent to the AI. Its wording was drafted without community input and is waiting for review by people from the communities it speaks to. Describe it exactly if asked. Don't promote it, or call it culturally safe or co-designed, until that review has happened.</w:t>
             </w:r>
           </w:p>
         </w:tc>
@@ -5453,7 +5453,7 @@
                 <w:sz w:val="18"/>
                 <w:szCs w:val="18"/>
               </w:rPr>
-              <w:t xml:space="preserve">Any figure from section 6 attributed to Groundwork itself.</w:t>
+              <w:t xml:space="preserve">Anything that positions Groundwork as therapy, treatment, or a mental-health intervention.</w:t>
             </w:r>
           </w:p>
         </w:tc>
@@ -5484,7 +5484,7 @@
                 <w:sz w:val="18"/>
                 <w:szCs w:val="18"/>
               </w:rPr>
-              <w:t xml:space="preserve">No outcome study of Groundwork exists yet. “Programmes of this kind have been shown to…” is defensible; “Groundwork delivers…” is not, until there is a pilot with pre/post data behind it.</w:t>
+              <w:t xml:space="preserve">The app says “this isn't a therapy app” on its own landing page and in settings, and directs students to Kids Helpline. Marketing must not contradict the product. This also keeps Groundwork out of a regulatory category it is not built for.</w:t>
             </w:r>
           </w:p>
         </w:tc>
@@ -5548,7 +5548,7 @@
                 <w:sz w:val="18"/>
                 <w:szCs w:val="18"/>
               </w:rPr>
-              <w:t xml:space="preserve">“Track your students' progress”, said to a teacher or school.</w:t>
+              <w:t xml:space="preserve">Any figure from section 6 attributed to Groundwork itself.</w:t>
             </w:r>
           </w:p>
         </w:tc>
@@ -5579,7 +5579,197 @@
                 <w:sz w:val="18"/>
                 <w:szCs w:val="18"/>
               </w:rPr>
+              <w:t xml:space="preserve">No outcome study of Groundwork exists yet. “Programmes of this kind have been shown to…” is defensible; “Groundwork delivers…” is not, until there is a pilot with pre/post data behind it.</w:t>
+            </w:r>
+          </w:p>
+        </w:tc>
+      </w:tr>
+      <w:tr>
+        <w:tc>
+          <w:tcPr>
+            <w:tcW w:type="dxa" w:w="1250"/>
+            <w:tcBorders>
+              <w:top w:val="single" w:color="DCDCD4" w:sz="4"/>
+              <w:left w:val="single" w:color="DCDCD4" w:sz="4"/>
+              <w:bottom w:val="single" w:color="DCDCD4" w:sz="4"/>
+              <w:right w:val="single" w:color="DCDCD4" w:sz="4"/>
+            </w:tcBorders>
+            <w:tcMar>
+              <w:top w:type="dxa" w:w="110"/>
+              <w:left w:type="dxa" w:w="140"/>
+              <w:bottom w:type="dxa" w:w="110"/>
+              <w:right w:type="dxa" w:w="140"/>
+            </w:tcMar>
+          </w:tcPr>
+          <w:p>
+            <w:pPr>
+              <w:spacing w:line="264"/>
+            </w:pPr>
+            <w:r>
+              <w:rPr>
+                <w:rFonts w:ascii="Calibri" w:cs="Calibri" w:eastAsia="Calibri" w:hAnsi="Calibri"/>
+                <w:color w:val="17222E"/>
+                <w:sz w:val="18"/>
+                <w:szCs w:val="18"/>
+              </w:rPr>
+              <w:t xml:space="preserve">NEVER</w:t>
+            </w:r>
+          </w:p>
+        </w:tc>
+        <w:tc>
+          <w:tcPr>
+            <w:tcW w:type="dxa" w:w="3376"/>
+            <w:tcBorders>
+              <w:top w:val="single" w:color="DCDCD4" w:sz="4"/>
+              <w:left w:val="single" w:color="DCDCD4" w:sz="4"/>
+              <w:bottom w:val="single" w:color="DCDCD4" w:sz="4"/>
+              <w:right w:val="single" w:color="DCDCD4" w:sz="4"/>
+            </w:tcBorders>
+            <w:tcMar>
+              <w:top w:type="dxa" w:w="110"/>
+              <w:left w:type="dxa" w:w="140"/>
+              <w:bottom w:type="dxa" w:w="110"/>
+              <w:right w:type="dxa" w:w="140"/>
+            </w:tcMar>
+          </w:tcPr>
+          <w:p>
+            <w:pPr>
+              <w:spacing w:line="264"/>
+            </w:pPr>
+            <w:r>
+              <w:rPr>
+                <w:rFonts w:ascii="Calibri" w:cs="Calibri" w:eastAsia="Calibri" w:hAnsi="Calibri"/>
+                <w:color w:val="4E5A66"/>
+                <w:sz w:val="18"/>
+                <w:szCs w:val="18"/>
+              </w:rPr>
+              <w:t xml:space="preserve">“Track your students' progress”, said to a teacher or school.</w:t>
+            </w:r>
+          </w:p>
+        </w:tc>
+        <w:tc>
+          <w:tcPr>
+            <w:tcW w:type="dxa" w:w="4400"/>
+            <w:tcBorders>
+              <w:top w:val="single" w:color="DCDCD4" w:sz="4"/>
+              <w:left w:val="single" w:color="DCDCD4" w:sz="4"/>
+              <w:bottom w:val="single" w:color="DCDCD4" w:sz="4"/>
+              <w:right w:val="single" w:color="DCDCD4" w:sz="4"/>
+            </w:tcBorders>
+            <w:tcMar>
+              <w:top w:type="dxa" w:w="110"/>
+              <w:left w:type="dxa" w:w="140"/>
+              <w:bottom w:type="dxa" w:w="110"/>
+              <w:right w:type="dxa" w:w="140"/>
+            </w:tcMar>
+          </w:tcPr>
+          <w:p>
+            <w:pPr>
+              <w:spacing w:line="264"/>
+            </w:pPr>
+            <w:r>
+              <w:rPr>
+                <w:rFonts w:ascii="Calibri" w:cs="Calibri" w:eastAsia="Calibri" w:hAnsi="Calibri"/>
+                <w:color w:val="4E5A66"/>
+                <w:sz w:val="18"/>
+                <w:szCs w:val="18"/>
+              </w:rPr>
               <w:t xml:space="preserve">There is no teacher dashboard and journals are private by design. Promising visibility that doesn't exist — and shouldn't — sets up a failed implementation. The most Groundwork can offer is completion totals: how many students finish each step, across everyone, with counts under five hidden. There's no per-class or per-student view, so don't promise one, and never anything a student wrote.</w:t>
+            </w:r>
+          </w:p>
+        </w:tc>
+      </w:tr>
+      <w:tr>
+        <w:tc>
+          <w:tcPr>
+            <w:tcW w:type="dxa" w:w="1250"/>
+            <w:tcBorders>
+              <w:top w:val="single" w:color="DCDCD4" w:sz="4"/>
+              <w:left w:val="single" w:color="DCDCD4" w:sz="4"/>
+              <w:bottom w:val="single" w:color="DCDCD4" w:sz="4"/>
+              <w:right w:val="single" w:color="DCDCD4" w:sz="4"/>
+            </w:tcBorders>
+            <w:tcMar>
+              <w:top w:type="dxa" w:w="110"/>
+              <w:left w:type="dxa" w:w="140"/>
+              <w:bottom w:type="dxa" w:w="110"/>
+              <w:right w:type="dxa" w:w="140"/>
+            </w:tcMar>
+          </w:tcPr>
+          <w:p>
+            <w:pPr>
+              <w:spacing w:line="264"/>
+            </w:pPr>
+            <w:r>
+              <w:rPr>
+                <w:rFonts w:ascii="Calibri" w:cs="Calibri" w:eastAsia="Calibri" w:hAnsi="Calibri"/>
+                <w:color w:val="17222E"/>
+                <w:sz w:val="18"/>
+                <w:szCs w:val="18"/>
+              </w:rPr>
+              <w:t xml:space="preserve">NEVER</w:t>
+            </w:r>
+          </w:p>
+        </w:tc>
+        <w:tc>
+          <w:tcPr>
+            <w:tcW w:type="dxa" w:w="3376"/>
+            <w:tcBorders>
+              <w:top w:val="single" w:color="DCDCD4" w:sz="4"/>
+              <w:left w:val="single" w:color="DCDCD4" w:sz="4"/>
+              <w:bottom w:val="single" w:color="DCDCD4" w:sz="4"/>
+              <w:right w:val="single" w:color="DCDCD4" w:sz="4"/>
+            </w:tcBorders>
+            <w:tcMar>
+              <w:top w:type="dxa" w:w="110"/>
+              <w:left w:type="dxa" w:w="140"/>
+              <w:bottom w:type="dxa" w:w="110"/>
+              <w:right w:type="dxa" w:w="140"/>
+            </w:tcMar>
+          </w:tcPr>
+          <w:p>
+            <w:pPr>
+              <w:spacing w:line="264"/>
+            </w:pPr>
+            <w:r>
+              <w:rPr>
+                <w:rFonts w:ascii="Calibri" w:cs="Calibri" w:eastAsia="Calibri" w:hAnsi="Calibri"/>
+                <w:color w:val="4E5A66"/>
+                <w:sz w:val="18"/>
+                <w:szCs w:val="18"/>
+              </w:rPr>
+              <w:t xml:space="preserve">“Covers the HPE curriculum”, or anything implying Groundwork teaches consent, respectful relationships or protective behaviours.</w:t>
+            </w:r>
+          </w:p>
+        </w:tc>
+        <w:tc>
+          <w:tcPr>
+            <w:tcW w:type="dxa" w:w="4400"/>
+            <w:tcBorders>
+              <w:top w:val="single" w:color="DCDCD4" w:sz="4"/>
+              <w:left w:val="single" w:color="DCDCD4" w:sz="4"/>
+              <w:bottom w:val="single" w:color="DCDCD4" w:sz="4"/>
+              <w:right w:val="single" w:color="DCDCD4" w:sz="4"/>
+            </w:tcBorders>
+            <w:tcMar>
+              <w:top w:type="dxa" w:w="110"/>
+              <w:left w:type="dxa" w:w="140"/>
+              <w:bottom w:type="dxa" w:w="110"/>
+              <w:right w:type="dxa" w:w="140"/>
+            </w:tcMar>
+          </w:tcPr>
+          <w:p>
+            <w:pPr>
+              <w:spacing w:line="264"/>
+            </w:pPr>
+            <w:r>
+              <w:rPr>
+                <w:rFonts w:ascii="Calibri" w:cs="Calibri" w:eastAsia="Calibri" w:hAnsi="Calibri"/>
+                <w:color w:val="4E5A66"/>
+                <w:sz w:val="18"/>
+                <w:szCs w:val="18"/>
+              </w:rPr>
+              <w:t xml:space="preserve">The mapping lists these as gaps, on purpose: they need a teacher, a class and the school’s own respectful relationships programme. A school that buys Groundwork thinking those boxes are ticked has been misled, and will find out. Don’t claim the Aboriginal and Torres Strait Islander cross-curriculum priority either, until the Culture and Heritage review is done.</w:t>
             </w:r>
           </w:p>
         </w:tc>
@@ -5712,7 +5902,7 @@
           <w:sz w:val="20"/>
           <w:szCs w:val="20"/>
         </w:rPr>
-        <w:t xml:space="preserve"> Five CASEL competencies, activity by activity.</w:t>
+        <w:t xml:space="preserve"> Five CASEL competencies, activity by activity, and the HPE curriculum's Identities and change content, code by code.</w:t>
       </w:r>
     </w:p>
     <w:p>
@@ -6849,7 +7039,7 @@
                 <w:sz w:val="20"/>
                 <w:szCs w:val="20"/>
               </w:rPr>
-              <w:t xml:space="preserve">Two things worth knowing up front. Every activity maps to a CASEL competency and I'm happy to send the mapping. And no teacher or parent can read student writing — that's deliberate, and it's why they write honestly.</w:t>
+              <w:t xml:space="preserve">Two things worth knowing up front. Every activity maps to a CASEL competency, and to the Identities and change content of the HPE curriculum, and I'm happy to send both mappings. And no teacher or parent can read student writing — that's deliberate, and it's why they write honestly.</w:t>
             </w:r>
           </w:p>
           <w:p>
@@ -7072,7 +7262,7 @@
           <w:sz w:val="20"/>
           <w:szCs w:val="20"/>
         </w:rPr>
-        <w:t xml:space="preserve">Items 1, 2, 5–8, 11–13 and 15 are the frameworks Groundwork's activities are built on. Items 3, 4, 9, 10, 14 and 16–25 are the empirical results quoted in this guide. Verified September 2026; items 24 and 25 added October 2026.</w:t>
+        <w:t xml:space="preserve">Items 1, 2, 5–8, 11–13 and 15 are the frameworks Groundwork's activities are built on. Items 3, 4, 9, 10, 14 and 16–25 are the empirical results quoted in this guide. Items 26 and 27 are the Australian documents the curriculum line is mapped against. Verified September 2026; items 24–27 added October 2026.</w:t>
       </w:r>
     </w:p>
     <w:p>
@@ -8652,6 +8842,132 @@
     </w:p>
     <w:p>
       <w:pPr>
+        <w:spacing w:after="20" w:before="100" w:line="264"/>
+        <w:ind w:left="420" w:hanging="420"/>
+      </w:pPr>
+      <w:r>
+        <w:rPr>
+          <w:rFonts w:ascii="Calibri" w:cs="Calibri" w:eastAsia="Calibri" w:hAnsi="Calibri"/>
+          <w:b/>
+          <w:bCs/>
+          <w:color w:val="17222E"/>
+          <w:sz w:val="19"/>
+          <w:szCs w:val="19"/>
+        </w:rPr>
+        <w:t xml:space="preserve">26.  </w:t>
+      </w:r>
+      <w:r>
+        <w:rPr>
+          <w:rFonts w:ascii="Calibri" w:cs="Calibri" w:eastAsia="Calibri" w:hAnsi="Calibri"/>
+          <w:color w:val="4E5A66"/>
+          <w:sz w:val="19"/>
+          <w:szCs w:val="19"/>
+        </w:rPr>
+        <w:t xml:space="preserve">Australian Curriculum, Assessment and Reporting Authority (ACARA). (2022). </w:t>
+      </w:r>
+      <w:r>
+        <w:rPr>
+          <w:rFonts w:ascii="Calibri" w:cs="Calibri" w:eastAsia="Calibri" w:hAnsi="Calibri"/>
+          <w:i/>
+          <w:iCs/>
+          <w:color w:val="4E5A66"/>
+          <w:sz w:val="19"/>
+          <w:szCs w:val="19"/>
+        </w:rPr>
+        <w:t xml:space="preserve">Australian Curriculum: Health and Physical Education, Version 9.0</w:t>
+      </w:r>
+      <w:r>
+        <w:rPr>
+          <w:rFonts w:ascii="Calibri" w:cs="Calibri" w:eastAsia="Calibri" w:hAnsi="Calibri"/>
+          <w:color w:val="4E5A66"/>
+          <w:sz w:val="19"/>
+          <w:szCs w:val="19"/>
+        </w:rPr>
+        <w:t xml:space="preserve">, and the general capabilities. australiancurriculum.edu.au</w:t>
+      </w:r>
+    </w:p>
+    <w:p>
+      <w:pPr>
+        <w:spacing w:after="60" w:line="252"/>
+        <w:ind w:left="420"/>
+      </w:pPr>
+      <w:r>
+        <w:rPr>
+          <w:rFonts w:ascii="Calibri" w:cs="Calibri" w:eastAsia="Calibri" w:hAnsi="Calibri"/>
+          <w:i/>
+          <w:iCs/>
+          <w:color w:val="7E8892"/>
+          <w:sz w:val="17"/>
+          <w:szCs w:val="17"/>
+        </w:rPr>
+        <w:t xml:space="preserve">The HPE content descriptions and capabilities in the curriculum line; codes checked October 2026.</w:t>
+      </w:r>
+    </w:p>
+    <w:p>
+      <w:pPr>
+        <w:spacing w:after="20" w:before="100" w:line="264"/>
+        <w:ind w:left="420" w:hanging="420"/>
+      </w:pPr>
+      <w:r>
+        <w:rPr>
+          <w:rFonts w:ascii="Calibri" w:cs="Calibri" w:eastAsia="Calibri" w:hAnsi="Calibri"/>
+          <w:b/>
+          <w:bCs/>
+          <w:color w:val="17222E"/>
+          <w:sz w:val="19"/>
+          <w:szCs w:val="19"/>
+        </w:rPr>
+        <w:t xml:space="preserve">27.  </w:t>
+      </w:r>
+      <w:r>
+        <w:rPr>
+          <w:rFonts w:ascii="Calibri" w:cs="Calibri" w:eastAsia="Calibri" w:hAnsi="Calibri"/>
+          <w:color w:val="4E5A66"/>
+          <w:sz w:val="19"/>
+          <w:szCs w:val="19"/>
+        </w:rPr>
+        <w:t xml:space="preserve">Australian Government Department of Education. (2018). </w:t>
+      </w:r>
+      <w:r>
+        <w:rPr>
+          <w:rFonts w:ascii="Calibri" w:cs="Calibri" w:eastAsia="Calibri" w:hAnsi="Calibri"/>
+          <w:i/>
+          <w:iCs/>
+          <w:color w:val="4E5A66"/>
+          <w:sz w:val="19"/>
+          <w:szCs w:val="19"/>
+        </w:rPr>
+        <w:t xml:space="preserve">The Australian Student Wellbeing Framework.</w:t>
+      </w:r>
+      <w:r>
+        <w:rPr>
+          <w:rFonts w:ascii="Calibri" w:cs="Calibri" w:eastAsia="Calibri" w:hAnsi="Calibri"/>
+          <w:color w:val="4E5A66"/>
+          <w:sz w:val="19"/>
+          <w:szCs w:val="19"/>
+        </w:rPr>
+        <w:t xml:space="preserve"> Education Services Australia. studentwellbeinghub.edu.au</w:t>
+      </w:r>
+    </w:p>
+    <w:p>
+      <w:pPr>
+        <w:spacing w:after="60" w:line="252"/>
+        <w:ind w:left="420"/>
+      </w:pPr>
+      <w:r>
+        <w:rPr>
+          <w:rFonts w:ascii="Calibri" w:cs="Calibri" w:eastAsia="Calibri" w:hAnsi="Calibri"/>
+          <w:i/>
+          <w:iCs/>
+          <w:color w:val="7E8892"/>
+          <w:sz w:val="17"/>
+          <w:szCs w:val="17"/>
+        </w:rPr>
+        <w:t xml:space="preserve">The five elements and effective practices Groundwork is mapped against.</w:t>
+      </w:r>
+    </w:p>
+    <w:p>
+      <w:pPr>
         <w:pBdr>
           <w:bottom w:val="single" w:color="DCDCD4" w:sz="6"/>
         </w:pBdr>
@@ -8672,7 +8988,7 @@
           <w:sz w:val="18"/>
           <w:szCs w:val="18"/>
         </w:rPr>
-        <w:t xml:space="preserve">Internal marketing guide. Product facts are drawn from the Groundwork repository — docs/frameworks.md, src/lib/missions.ts, src/lib/program.ts, src/lib/standard.ts and src/lib/spine.ts — and reflect the build as at October 2026. Re-check the claim ladder in section 7 whenever the product changes.</w:t>
+        <w:t xml:space="preserve">Internal marketing guide. Product facts are drawn from the Groundwork repository — docs/frameworks.md, docs/curriculum-alignment.md, src/lib/missions.ts, src/lib/program.ts, src/lib/standard.ts and src/lib/spine.ts — and reflect the build as at October 2026. Re-check the claim ladder in section 7 whenever the product changes.</w:t>
       </w:r>
     </w:p>
     <w:p>

</xml_diff>